<commit_message>
Add annual performance evaluation reporting
</commit_message>
<xml_diff>
--- a/backend/templates/duty_order_template.docx
+++ b/backend/templates/duty_order_template.docx
@@ -21,13 +21,13 @@
           <wp:anchor distT="0" distB="0" distL="114300" distR="114300" simplePos="0" relativeHeight="251659264" behindDoc="1" locked="0" layoutInCell="1" allowOverlap="1" wp14:anchorId="414B18D3" wp14:editId="79042C5E">
             <wp:simplePos x="0" y="0"/>
             <wp:positionH relativeFrom="column">
-              <wp:posOffset>2266950</wp:posOffset>
+              <wp:posOffset>2381250</wp:posOffset>
             </wp:positionH>
             <wp:positionV relativeFrom="paragraph">
-              <wp:posOffset>-102870</wp:posOffset>
+              <wp:posOffset>-131445</wp:posOffset>
             </wp:positionV>
-            <wp:extent cx="1018256" cy="1260000"/>
-            <wp:effectExtent l="0" t="0" r="0" b="0"/>
+            <wp:extent cx="872490" cy="1079500"/>
+            <wp:effectExtent l="0" t="0" r="3810" b="6350"/>
             <wp:wrapNone/>
             <wp:docPr id="1" name="รูปภาพ 1"/>
             <wp:cNvGraphicFramePr>
@@ -59,7 +59,7 @@
                   <pic:spPr bwMode="auto">
                     <a:xfrm>
                       <a:off x="0" y="0"/>
-                      <a:ext cx="1018256" cy="1260000"/>
+                      <a:ext cx="872490" cy="1079500"/>
                     </a:xfrm>
                     <a:prstGeom prst="rect">
                       <a:avLst/>
@@ -127,12 +127,51 @@
           <w:tab w:val="left" w:pos="7655"/>
           <w:tab w:val="center" w:pos="7938"/>
         </w:tabs>
-        <w:spacing w:after="0" w:line="240" w:lineRule="auto"/>
+        <w:spacing w:before="240" w:after="0" w:line="240" w:lineRule="auto"/>
         <w:jc w:val="center"/>
         <w:rPr>
           <w:rFonts w:ascii="TH SarabunIT๙" w:hAnsi="TH SarabunIT๙" w:cs="TH SarabunIT๙"/>
         </w:rPr>
       </w:pPr>
+      <w:r>
+        <w:rPr>
+          <w:rFonts w:ascii="TH SarabunIT๙" w:hAnsi="TH SarabunIT๙" w:cs="TH SarabunIT๙"/>
+          <w:cs/>
+        </w:rPr>
+        <w:t>คำสั่ง{</w:t>
+      </w:r>
+      <w:proofErr w:type="spellStart"/>
+      <w:r>
+        <w:rPr>
+          <w:rFonts w:ascii="TH SarabunIT๙" w:hAnsi="TH SarabunIT๙" w:cs="TH SarabunIT๙"/>
+          <w:cs/>
+        </w:rPr>
+        <w:t>court</w:t>
+      </w:r>
+      <w:proofErr w:type="spellEnd"/>
+      <w:r>
+        <w:rPr>
+          <w:rFonts w:ascii="TH SarabunIT๙" w:hAnsi="TH SarabunIT๙" w:cs="TH SarabunIT๙"/>
+          <w:cs/>
+        </w:rPr>
+        <w:t>_</w:t>
+      </w:r>
+      <w:proofErr w:type="spellStart"/>
+      <w:r>
+        <w:rPr>
+          <w:rFonts w:ascii="TH SarabunIT๙" w:hAnsi="TH SarabunIT๙" w:cs="TH SarabunIT๙"/>
+          <w:cs/>
+        </w:rPr>
+        <w:t>name</w:t>
+      </w:r>
+      <w:proofErr w:type="spellEnd"/>
+      <w:r>
+        <w:rPr>
+          <w:rFonts w:ascii="TH SarabunIT๙" w:hAnsi="TH SarabunIT๙" w:cs="TH SarabunIT๙"/>
+          <w:cs/>
+        </w:rPr>
+        <w:t>}</w:t>
+      </w:r>
     </w:p>
     <w:p>
       <w:pPr>
@@ -154,7 +193,7 @@
           <w:rFonts w:ascii="TH SarabunIT๙" w:hAnsi="TH SarabunIT๙" w:cs="TH SarabunIT๙"/>
           <w:cs/>
         </w:rPr>
-        <w:t>คำสั่ง{court_name}</w:t>
+        <w:t>ที่ {order_number}</w:t>
       </w:r>
     </w:p>
     <w:p>
@@ -177,7 +216,7 @@
           <w:rFonts w:ascii="TH SarabunIT๙" w:hAnsi="TH SarabunIT๙" w:cs="TH SarabunIT๙"/>
           <w:cs/>
         </w:rPr>
-        <w:t>ที่ {order_number}</w:t>
+        <w:t>เรื่อง {order_title}</w:t>
       </w:r>
     </w:p>
     <w:p>
@@ -200,29 +239,6 @@
           <w:rFonts w:ascii="TH SarabunIT๙" w:hAnsi="TH SarabunIT๙" w:cs="TH SarabunIT๙"/>
           <w:cs/>
         </w:rPr>
-        <w:t>เรื่อง {order_title}</w:t>
-      </w:r>
-    </w:p>
-    <w:p>
-      <w:pPr>
-        <w:tabs>
-          <w:tab w:val="left" w:pos="567"/>
-          <w:tab w:val="left" w:pos="4111"/>
-          <w:tab w:val="left" w:pos="5954"/>
-          <w:tab w:val="left" w:pos="7655"/>
-          <w:tab w:val="center" w:pos="7938"/>
-        </w:tabs>
-        <w:spacing w:after="0" w:line="276" w:lineRule="auto"/>
-        <w:jc w:val="center"/>
-        <w:rPr>
-          <w:rFonts w:ascii="TH SarabunIT๙" w:hAnsi="TH SarabunIT๙" w:cs="TH SarabunIT๙"/>
-        </w:rPr>
-      </w:pPr>
-      <w:r>
-        <w:rPr>
-          <w:rFonts w:ascii="TH SarabunIT๙" w:hAnsi="TH SarabunIT๙" w:cs="TH SarabunIT๙"/>
-          <w:cs/>
-        </w:rPr>
         <w:t>ประจำเดือน {order_month_th} เวลา {start_time} - {end_time} นาฬิกา</w:t>
       </w:r>
     </w:p>
@@ -269,6 +285,8 @@
         </w:rPr>
         <w:t>{#schedules}</w:t>
       </w:r>
+      <w:bookmarkStart w:id="0" w:name="_GoBack"/>
+      <w:bookmarkEnd w:id="0"/>
     </w:p>
     <w:p>
       <w:pPr>
@@ -278,7 +296,7 @@
           <w:tab w:val="left" w:pos="5812"/>
           <w:tab w:val="left" w:pos="7655"/>
         </w:tabs>
-        <w:spacing w:after="0" w:line="240" w:lineRule="auto"/>
+        <w:spacing w:after="240" w:line="240" w:lineRule="auto"/>
         <w:rPr>
           <w:rFonts w:ascii="TH SarabunIT๙" w:eastAsia="Times New Roman" w:hAnsi="TH SarabunIT๙" w:cs="TH SarabunIT๙"/>
         </w:rPr>
@@ -328,8 +346,6 @@
         </w:rPr>
         <w:t>{/schedules}</w:t>
       </w:r>
-      <w:bookmarkStart w:id="0" w:name="_GoBack"/>
-      <w:bookmarkEnd w:id="0"/>
     </w:p>
     <w:p>
       <w:pPr>
@@ -433,37 +449,22 @@
           <w:tab w:val="left" w:pos="5954"/>
           <w:tab w:val="left" w:pos="7797"/>
         </w:tabs>
-        <w:spacing w:before="120" w:after="0" w:line="240" w:lineRule="auto"/>
+        <w:spacing w:before="240" w:after="0" w:line="240" w:lineRule="auto"/>
         <w:rPr>
           <w:rFonts w:ascii="TH SarabunIT๙" w:eastAsia="Times New Roman" w:hAnsi="TH SarabunIT๙" w:cs="TH SarabunIT๙"/>
-          <w:cs/>
-        </w:rPr>
-      </w:pPr>
+        </w:rPr>
+      </w:pPr>
+      <w:r>
+        <w:rPr>
+          <w:rFonts w:ascii="TH SarabunIT๙" w:eastAsia="Times New Roman" w:hAnsi="TH SarabunIT๙" w:cs="TH SarabunIT๙"/>
+          <w:cs/>
+        </w:rPr>
+        <w:t>อนึ่ง หากท่านไม่สามารถมาปฏิบัติหน้าที่ตามคำสั่งได้ ให้จัดหาผู้ปฏิบัติหน้าที่แทนเป็นลายลักษณ์อักษร</w:t>
+      </w:r>
     </w:p>
     <w:p>
       <w:pPr>
-        <w:tabs>
-          <w:tab w:val="left" w:pos="567"/>
-          <w:tab w:val="left" w:pos="4111"/>
-          <w:tab w:val="left" w:pos="5954"/>
-          <w:tab w:val="left" w:pos="7797"/>
-        </w:tabs>
-        <w:spacing w:after="0" w:line="240" w:lineRule="auto"/>
-        <w:rPr>
-          <w:rFonts w:ascii="TH SarabunIT๙" w:eastAsia="Times New Roman" w:hAnsi="TH SarabunIT๙" w:cs="TH SarabunIT๙"/>
-        </w:rPr>
-      </w:pPr>
-      <w:r>
-        <w:rPr>
-          <w:rFonts w:ascii="TH SarabunIT๙" w:eastAsia="Times New Roman" w:hAnsi="TH SarabunIT๙" w:cs="TH SarabunIT๙"/>
-          <w:cs/>
-        </w:rPr>
-        <w:t>อนึ่ง หากท่านไม่สามารถมาปฏิบัติหน้าที่ตามคำสั่งได้ ให้จัดหาผู้ปฏิบัติหน้าที่แทนเป็นลายลักษณ์อักษร</w:t>
-      </w:r>
-    </w:p>
-    <w:p>
-      <w:pPr>
-        <w:spacing w:after="0" w:line="240" w:lineRule="auto"/>
+        <w:spacing w:before="240" w:after="0" w:line="240" w:lineRule="auto"/>
         <w:jc w:val="center"/>
         <w:rPr>
           <w:rFonts w:ascii="TH SarabunIT๙" w:eastAsia="Times New Roman" w:hAnsi="TH SarabunIT๙" w:cs="TH SarabunIT๙"/>
@@ -537,7 +538,7 @@
     </w:p>
     <w:sectPr>
       <w:pgSz w:w="11906" w:h="16838" w:code="9"/>
-      <w:pgMar w:top="426" w:right="1440" w:bottom="142" w:left="1440" w:header="720" w:footer="720" w:gutter="0"/>
+      <w:pgMar w:top="993" w:right="1440" w:bottom="851" w:left="1440" w:header="720" w:footer="720" w:gutter="0"/>
       <w:cols w:space="720"/>
       <w:docGrid w:linePitch="462"/>
     </w:sectPr>
@@ -2209,7 +2210,7 @@
 </file>
 
 <file path=customXml/itemProps1.xml><?xml version="1.0" encoding="utf-8"?>
-<ds:datastoreItem xmlns:ds="http://schemas.openxmlformats.org/officeDocument/2006/customXml" ds:itemID="{F7EF8DAB-CAC3-4EB0-AD32-BF085CD58942}">
+<ds:datastoreItem xmlns:ds="http://schemas.openxmlformats.org/officeDocument/2006/customXml" ds:itemID="{013901FE-B4EC-4104-B33B-4DFFECCD7AED}">
   <ds:schemaRefs>
     <ds:schemaRef ds:uri="http://schemas.openxmlformats.org/officeDocument/2006/bibliography"/>
   </ds:schemaRefs>

</xml_diff>

<commit_message>
Add payment evidence review and duty order types
</commit_message>
<xml_diff>
--- a/backend/templates/duty_order_template.docx
+++ b/backend/templates/duty_order_template.docx
@@ -285,8 +285,6 @@
         </w:rPr>
         <w:t>{#schedules}</w:t>
       </w:r>
-      <w:bookmarkStart w:id="0" w:name="_GoBack"/>
-      <w:bookmarkEnd w:id="0"/>
     </w:p>
     <w:p>
       <w:pPr>
@@ -306,7 +304,55 @@
           <w:rFonts w:ascii="TH SarabunIT๙" w:eastAsia="Times New Roman" w:hAnsi="TH SarabunIT๙" w:cs="TH SarabunIT๙"/>
           <w:cs/>
         </w:rPr>
-        <w:t>{duty_date_th}</w:t>
+        <w:t>{</w:t>
+      </w:r>
+      <w:proofErr w:type="spellStart"/>
+      <w:r>
+        <w:rPr>
+          <w:rFonts w:ascii="TH SarabunIT๙" w:eastAsia="Times New Roman" w:hAnsi="TH SarabunIT๙" w:cs="TH SarabunIT๙"/>
+          <w:cs/>
+        </w:rPr>
+        <w:t>duty</w:t>
+      </w:r>
+      <w:proofErr w:type="spellEnd"/>
+      <w:r>
+        <w:rPr>
+          <w:rFonts w:ascii="TH SarabunIT๙" w:eastAsia="Times New Roman" w:hAnsi="TH SarabunIT๙" w:cs="TH SarabunIT๙"/>
+          <w:cs/>
+        </w:rPr>
+        <w:t>_</w:t>
+      </w:r>
+      <w:proofErr w:type="spellStart"/>
+      <w:r>
+        <w:rPr>
+          <w:rFonts w:ascii="TH SarabunIT๙" w:eastAsia="Times New Roman" w:hAnsi="TH SarabunIT๙" w:cs="TH SarabunIT๙"/>
+          <w:cs/>
+        </w:rPr>
+        <w:t>date</w:t>
+      </w:r>
+      <w:proofErr w:type="spellEnd"/>
+      <w:r>
+        <w:rPr>
+          <w:rFonts w:ascii="TH SarabunIT๙" w:eastAsia="Times New Roman" w:hAnsi="TH SarabunIT๙" w:cs="TH SarabunIT๙"/>
+          <w:cs/>
+        </w:rPr>
+        <w:t>_</w:t>
+      </w:r>
+      <w:proofErr w:type="spellStart"/>
+      <w:r>
+        <w:rPr>
+          <w:rFonts w:ascii="TH SarabunIT๙" w:eastAsia="Times New Roman" w:hAnsi="TH SarabunIT๙" w:cs="TH SarabunIT๙"/>
+          <w:cs/>
+        </w:rPr>
+        <w:t>th</w:t>
+      </w:r>
+      <w:proofErr w:type="spellEnd"/>
+      <w:r>
+        <w:rPr>
+          <w:rFonts w:ascii="TH SarabunIT๙" w:eastAsia="Times New Roman" w:hAnsi="TH SarabunIT๙" w:cs="TH SarabunIT๙"/>
+          <w:cs/>
+        </w:rPr>
+        <w:t>}</w:t>
       </w:r>
       <w:r>
         <w:rPr>
@@ -314,7 +360,22 @@
           <w:cs/>
         </w:rPr>
         <w:tab/>
-        <w:t>{duty_type_name}</w:t>
+        <w:t>{</w:t>
+      </w:r>
+      <w:r>
+        <w:rPr>
+          <w:rFonts w:ascii="TH SarabunIT๙" w:eastAsia="Times New Roman" w:hAnsi="TH SarabunIT๙" w:cs="TH SarabunIT๙"/>
+        </w:rPr>
+        <w:t>team_name</w:t>
+      </w:r>
+      <w:bookmarkStart w:id="0" w:name="_GoBack"/>
+      <w:bookmarkEnd w:id="0"/>
+      <w:r>
+        <w:rPr>
+          <w:rFonts w:ascii="TH SarabunIT๙" w:eastAsia="Times New Roman" w:hAnsi="TH SarabunIT๙" w:cs="TH SarabunIT๙"/>
+          <w:cs/>
+        </w:rPr>
+        <w:t>}</w:t>
       </w:r>
       <w:r>
         <w:rPr>
@@ -322,7 +383,23 @@
           <w:cs/>
         </w:rPr>
         <w:tab/>
-        <w:t>{names}</w:t>
+        <w:t>{</w:t>
+      </w:r>
+      <w:proofErr w:type="spellStart"/>
+      <w:r>
+        <w:rPr>
+          <w:rFonts w:ascii="TH SarabunIT๙" w:eastAsia="Times New Roman" w:hAnsi="TH SarabunIT๙" w:cs="TH SarabunIT๙"/>
+          <w:cs/>
+        </w:rPr>
+        <w:t>names</w:t>
+      </w:r>
+      <w:proofErr w:type="spellEnd"/>
+      <w:r>
+        <w:rPr>
+          <w:rFonts w:ascii="TH SarabunIT๙" w:eastAsia="Times New Roman" w:hAnsi="TH SarabunIT๙" w:cs="TH SarabunIT๙"/>
+          <w:cs/>
+        </w:rPr>
+        <w:t>}</w:t>
       </w:r>
     </w:p>
     <w:p>
@@ -2210,7 +2287,7 @@
 </file>
 
 <file path=customXml/itemProps1.xml><?xml version="1.0" encoding="utf-8"?>
-<ds:datastoreItem xmlns:ds="http://schemas.openxmlformats.org/officeDocument/2006/customXml" ds:itemID="{013901FE-B4EC-4104-B33B-4DFFECCD7AED}">
+<ds:datastoreItem xmlns:ds="http://schemas.openxmlformats.org/officeDocument/2006/customXml" ds:itemID="{27F608C2-1929-436D-9755-FC2D18759A2A}">
   <ds:schemaRefs>
     <ds:schemaRef ds:uri="http://schemas.openxmlformats.org/officeDocument/2006/bibliography"/>
   </ds:schemaRefs>

</xml_diff>